<commit_message>
updated subject line in email
</commit_message>
<xml_diff>
--- a/steps for qa comparison agent.docx
+++ b/steps for qa comparison agent.docx
@@ -61,6 +61,21 @@
         <w:br/>
       </w:r>
       <w:r>
+        <w:br/>
+      </w:r>
+      <w:r>
+        <w:br/>
+      </w:r>
+      <w:r>
+        <w:br/>
+      </w:r>
+      <w:r>
+        <w:br/>
+      </w:r>
+      <w:r>
+        <w:br/>
+      </w:r>
+      <w:r>
         <w:t xml:space="preserve">python -m </w:t>
       </w:r>
       <w:proofErr w:type="spellStart"/>
@@ -73,6 +88,9 @@
       </w:r>
       <w:r>
         <w:t xml:space="preserve">                                                      </w:t>
+      </w:r>
+      <w:r>
+        <w:br/>
       </w:r>
     </w:p>
     <w:p/>

</xml_diff>